<commit_message>
Kleinere Verbesserungen an der Checkliste
</commit_message>
<xml_diff>
--- a/_Checklisten/PRO_315_Checkliste_DM01_DMAV.docx
+++ b/_Checklisten/PRO_315_Checkliste_DM01_DMAV.docx
@@ -628,6 +628,169 @@
               <w:rPr>
                 <w:rStyle w:val="Fett"/>
               </w:rPr>
+              <w:t>Höhen entfernen</w:t>
+            </w:r>
+          </w:p>
+        </w:tc>
+      </w:tr>
+      <w:tr>
+        <w:sdt>
+          <w:sdtPr>
+            <w:id w:val="-1356031536"/>
+            <w14:checkbox>
+              <w14:checked w14:val="1"/>
+              <w14:checkedState w14:val="2612" w14:font="Arial Unicode MS"/>
+              <w14:uncheckedState w14:val="2610" w14:font="Arial Unicode MS"/>
+            </w14:checkbox>
+          </w:sdtPr>
+          <w:sdtContent>
+            <w:tc>
+              <w:tcPr>
+                <w:tcW w:w="426" w:type="dxa"/>
+                <w:vAlign w:val="center"/>
+              </w:tcPr>
+              <w:p>
+                <w:pPr>
+                  <w:rPr>
+                    <w:rFonts w:eastAsia="Calibri"/>
+                  </w:rPr>
+                </w:pPr>
+                <w:r>
+                  <w:rPr>
+                    <w:rFonts w:ascii="Arial Unicode MS" w:eastAsia="Arial Unicode MS" w:hAnsi="Arial Unicode MS" w:cs="Arial Unicode MS" w:hint="eastAsia"/>
+                  </w:rPr>
+                  <w:t>☒</w:t>
+                </w:r>
+              </w:p>
+            </w:tc>
+          </w:sdtContent>
+        </w:sdt>
+        <w:tc>
+          <w:tcPr>
+            <w:tcW w:w="6945" w:type="dxa"/>
+            <w:vAlign w:val="center"/>
+          </w:tcPr>
+          <w:p>
+            <w:pPr>
+              <w:rPr>
+                <w:rFonts w:eastAsia="Calibri"/>
+              </w:rPr>
+            </w:pPr>
+            <w:r>
+              <w:rPr>
+                <w:rFonts w:eastAsia="Calibri"/>
+              </w:rPr>
+              <w:t>JA – Die Objektklassen (LM_HE_*) und Daten können entfernt werden.</w:t>
+            </w:r>
+          </w:p>
+        </w:tc>
+        <w:tc>
+          <w:tcPr>
+            <w:tcW w:w="2370" w:type="dxa"/>
+            <w:tcBorders>
+              <w:bottom w:val="single" w:sz="4" w:space="0" w:color="auto"/>
+            </w:tcBorders>
+            <w:vAlign w:val="center"/>
+          </w:tcPr>
+          <w:p>
+            <w:pPr>
+              <w:rPr>
+                <w:rFonts w:eastAsia="Calibri"/>
+              </w:rPr>
+            </w:pPr>
+          </w:p>
+        </w:tc>
+      </w:tr>
+      <w:tr>
+        <w:sdt>
+          <w:sdtPr>
+            <w:id w:val="260969779"/>
+            <w14:checkbox>
+              <w14:checked w14:val="0"/>
+              <w14:checkedState w14:val="2612" w14:font="Arial Unicode MS"/>
+              <w14:uncheckedState w14:val="2610" w14:font="Arial Unicode MS"/>
+            </w14:checkbox>
+          </w:sdtPr>
+          <w:sdtContent>
+            <w:tc>
+              <w:tcPr>
+                <w:tcW w:w="426" w:type="dxa"/>
+                <w:vAlign w:val="center"/>
+              </w:tcPr>
+              <w:p>
+                <w:pPr>
+                  <w:rPr>
+                    <w:rFonts w:eastAsia="Calibri"/>
+                  </w:rPr>
+                </w:pPr>
+                <w:r>
+                  <w:rPr>
+                    <w:rFonts w:ascii="Arial Unicode MS" w:hAnsi="Arial Unicode MS"/>
+                  </w:rPr>
+                  <w:t>☐</w:t>
+                </w:r>
+              </w:p>
+            </w:tc>
+          </w:sdtContent>
+        </w:sdt>
+        <w:tc>
+          <w:tcPr>
+            <w:tcW w:w="6945" w:type="dxa"/>
+            <w:vAlign w:val="center"/>
+          </w:tcPr>
+          <w:p>
+            <w:pPr>
+              <w:rPr>
+                <w:rFonts w:eastAsia="Calibri"/>
+              </w:rPr>
+            </w:pPr>
+            <w:r>
+              <w:rPr>
+                <w:rFonts w:eastAsia="Calibri"/>
+              </w:rPr>
+              <w:t>NEIN – Die Objektklassen müssen in der Fachschale bleiben.</w:t>
+            </w:r>
+          </w:p>
+        </w:tc>
+        <w:tc>
+          <w:tcPr>
+            <w:tcW w:w="2370" w:type="dxa"/>
+            <w:tcBorders>
+              <w:top w:val="single" w:sz="4" w:space="0" w:color="auto"/>
+              <w:bottom w:val="single" w:sz="4" w:space="0" w:color="auto"/>
+            </w:tcBorders>
+            <w:vAlign w:val="center"/>
+          </w:tcPr>
+          <w:p>
+            <w:pPr>
+              <w:rPr>
+                <w:rFonts w:eastAsia="Calibri"/>
+              </w:rPr>
+            </w:pPr>
+          </w:p>
+        </w:tc>
+      </w:tr>
+      <w:tr>
+        <w:trPr>
+          <w:trHeight w:val="397"/>
+        </w:trPr>
+        <w:tc>
+          <w:tcPr>
+            <w:tcW w:w="9741" w:type="dxa"/>
+            <w:gridSpan w:val="3"/>
+            <w:shd w:val="clear" w:color="auto" w:fill="BFC3C6"/>
+            <w:vAlign w:val="center"/>
+          </w:tcPr>
+          <w:p>
+            <w:pPr>
+              <w:rPr>
+                <w:rStyle w:val="Fett"/>
+              </w:rPr>
+            </w:pPr>
+            <w:r>
+              <w:rPr>
+                <w:rStyle w:val="Fett"/>
+              </w:rPr>
               <w:t xml:space="preserve">Digitales Geländemodell </w:t>
             </w:r>
             <w:r>
@@ -829,11 +992,19 @@
                 <w:rStyle w:val="Fett"/>
               </w:rPr>
             </w:pPr>
+            <w:proofErr w:type="spellStart"/>
             <w:r>
               <w:rPr>
                 <w:rStyle w:val="Fett"/>
               </w:rPr>
-              <w:t>Nummerierungsbereich Geometrie entfernen</w:t>
+              <w:t>Nummerierungsbereich</w:t>
+            </w:r>
+            <w:proofErr w:type="spellEnd"/>
+            <w:r>
+              <w:rPr>
+                <w:rStyle w:val="Fett"/>
+              </w:rPr>
+              <w:t xml:space="preserve"> Geometrie entfernen</w:t>
             </w:r>
           </w:p>
         </w:tc>
@@ -1383,7 +1554,21 @@
               <w:rPr>
                 <w:rFonts w:eastAsia="Calibri"/>
               </w:rPr>
-              <w:t>«Verlauf des aktuellen Jobs löschen, wenn der Status auf «Live» eingestellt ist» wurde aktiviert)</w:t>
+              <w:t>«Verlauf des aktuellen Jobs löschen, wenn der Status auf «Live» eingestellt ist</w:t>
+            </w:r>
+            <w:proofErr w:type="gramStart"/>
+            <w:r>
+              <w:rPr>
+                <w:rFonts w:eastAsia="Calibri"/>
+              </w:rPr>
+              <w:t>»</w:t>
+            </w:r>
+            <w:proofErr w:type="gramEnd"/>
+            <w:r>
+              <w:rPr>
+                <w:rFonts w:eastAsia="Calibri"/>
+              </w:rPr>
+              <w:t xml:space="preserve"> wurde aktiviert)</w:t>
             </w:r>
           </w:p>
           <w:p>
@@ -1769,7 +1954,21 @@
               <w:rPr>
                 <w:rFonts w:eastAsia="Calibri"/>
               </w:rPr>
-              <w:t xml:space="preserve">Aktueller Interlis 1 Export erstellt (in der Regel im Bundesmodell für den </w:t>
+              <w:t xml:space="preserve">Aktueller </w:t>
+            </w:r>
+            <w:proofErr w:type="spellStart"/>
+            <w:r>
+              <w:rPr>
+                <w:rFonts w:eastAsia="Calibri"/>
+              </w:rPr>
+              <w:t>Interlis</w:t>
+            </w:r>
+            <w:proofErr w:type="spellEnd"/>
+            <w:r>
+              <w:rPr>
+                <w:rFonts w:eastAsia="Calibri"/>
+              </w:rPr>
+              <w:t xml:space="preserve"> 1 Export erstellt (in der Regel im Bundesmodell für den </w:t>
             </w:r>
             <w:r>
               <w:rPr>
@@ -2383,11 +2582,19 @@
                 <w:rFonts w:eastAsia="Calibri"/>
               </w:rPr>
             </w:pPr>
-            <w:r>
-              <w:rPr>
-                <w:rFonts w:eastAsia="Calibri"/>
-              </w:rPr>
-              <w:t>Interlis 2.4 Export Erweiterung aktiviert</w:t>
+            <w:proofErr w:type="spellStart"/>
+            <w:r>
+              <w:rPr>
+                <w:rFonts w:eastAsia="Calibri"/>
+              </w:rPr>
+              <w:t>Interlis</w:t>
+            </w:r>
+            <w:proofErr w:type="spellEnd"/>
+            <w:r>
+              <w:rPr>
+                <w:rFonts w:eastAsia="Calibri"/>
+              </w:rPr>
+              <w:t xml:space="preserve"> 2.4 Export Erweiterung aktiviert</w:t>
             </w:r>
           </w:p>
         </w:tc>
@@ -2558,51 +2765,6 @@
           <w:tcPr>
             <w:tcW w:w="2370" w:type="dxa"/>
             <w:tcBorders>
-              <w:bottom w:val="single" w:sz="4" w:space="0" w:color="auto"/>
-            </w:tcBorders>
-            <w:vAlign w:val="center"/>
-          </w:tcPr>
-          <w:p>
-            <w:pPr>
-              <w:rPr>
-                <w:rFonts w:eastAsia="Calibri"/>
-              </w:rPr>
-            </w:pPr>
-          </w:p>
-        </w:tc>
-      </w:tr>
-      <w:tr>
-        <w:tc>
-          <w:tcPr>
-            <w:tcW w:w="426" w:type="dxa"/>
-            <w:vAlign w:val="center"/>
-          </w:tcPr>
-          <w:p>
-            <w:pPr>
-              <w:rPr>
-                <w:rFonts w:ascii="Arial Unicode MS" w:hAnsi="Arial Unicode MS"/>
-              </w:rPr>
-            </w:pPr>
-          </w:p>
-        </w:tc>
-        <w:tc>
-          <w:tcPr>
-            <w:tcW w:w="6945" w:type="dxa"/>
-            <w:vAlign w:val="center"/>
-          </w:tcPr>
-          <w:p>
-            <w:pPr>
-              <w:rPr>
-                <w:rFonts w:eastAsia="Calibri"/>
-              </w:rPr>
-            </w:pPr>
-          </w:p>
-        </w:tc>
-        <w:tc>
-          <w:tcPr>
-            <w:tcW w:w="2370" w:type="dxa"/>
-            <w:tcBorders>
-              <w:top w:val="single" w:sz="4" w:space="0" w:color="auto"/>
               <w:bottom w:val="single" w:sz="4" w:space="0" w:color="auto"/>
             </w:tcBorders>
             <w:vAlign w:val="center"/>
@@ -2892,8 +3054,13 @@
       <w:pPr>
         <w:pStyle w:val="berschrift2"/>
       </w:pPr>
+      <w:proofErr w:type="spellStart"/>
       <w:r>
-        <w:t>Interlis 2.4 Schnittstelle</w:t>
+        <w:t>Interlis</w:t>
+      </w:r>
+      <w:proofErr w:type="spellEnd"/>
+      <w:r>
+        <w:t xml:space="preserve"> 2.4 Schnittstelle</w:t>
       </w:r>
     </w:p>
     <w:tbl>
@@ -2962,8 +3129,13 @@
             <w:vAlign w:val="center"/>
           </w:tcPr>
           <w:p>
-            <w:r>
-              <w:t>Interlis 2.4 Erweiterung aktiviert.</w:t>
+            <w:proofErr w:type="spellStart"/>
+            <w:r>
+              <w:t>Interlis</w:t>
+            </w:r>
+            <w:proofErr w:type="spellEnd"/>
+            <w:r>
+              <w:t xml:space="preserve"> 2.4 Erweiterung aktiviert.</w:t>
             </w:r>
           </w:p>
         </w:tc>
@@ -3095,8 +3267,13 @@
             <w:vAlign w:val="center"/>
           </w:tcPr>
           <w:p>
-            <w:r>
-              <w:t>DMAV Version 1.1 Konfigurationen (IEC)</w:t>
+            <w:proofErr w:type="gramStart"/>
+            <w:r>
+              <w:t>DMAV Version</w:t>
+            </w:r>
+            <w:proofErr w:type="gramEnd"/>
+            <w:r>
+              <w:t xml:space="preserve"> 1.1 Konfigurationen (IEC)</w:t>
             </w:r>
           </w:p>
         </w:tc>
@@ -3153,8 +3330,13 @@
             <w:vAlign w:val="center"/>
           </w:tcPr>
           <w:p>
-            <w:r>
-              <w:t>KGK Version 1.0 Konfigurationen (IEC)</w:t>
+            <w:proofErr w:type="gramStart"/>
+            <w:r>
+              <w:t>KGK Version</w:t>
+            </w:r>
+            <w:proofErr w:type="gramEnd"/>
+            <w:r>
+              <w:t xml:space="preserve"> 1.0 Konfigurationen (IEC)</w:t>
             </w:r>
           </w:p>
         </w:tc>
@@ -3212,7 +3394,17 @@
           </w:tcPr>
           <w:p>
             <w:r>
-              <w:t>Für alle Topics wurden die BID’s erstellt.</w:t>
+              <w:t xml:space="preserve">Für alle Topics wurden die </w:t>
+            </w:r>
+            <w:proofErr w:type="spellStart"/>
+            <w:proofErr w:type="gramStart"/>
+            <w:r>
+              <w:t>BID’s</w:t>
+            </w:r>
+            <w:proofErr w:type="spellEnd"/>
+            <w:proofErr w:type="gramEnd"/>
+            <w:r>
+              <w:t xml:space="preserve"> erstellt.</w:t>
             </w:r>
           </w:p>
         </w:tc>
@@ -3463,8 +3655,13 @@
           </w:tcPr>
           <w:p>
             <w:r>
-              <w:t>Webdienste AV Erweiterung aktviert</w:t>
-            </w:r>
+              <w:t xml:space="preserve">Webdienste AV Erweiterung </w:t>
+            </w:r>
+            <w:proofErr w:type="spellStart"/>
+            <w:r>
+              <w:t>aktviert</w:t>
+            </w:r>
+            <w:proofErr w:type="spellEnd"/>
           </w:p>
         </w:tc>
       </w:tr>
@@ -3611,10 +3808,18 @@
           </w:tcPr>
           <w:p>
             <w:r>
-              <w:t>Dienste ohne Bounding</w:t>
-            </w:r>
-            <w:r>
-              <w:t>box eingerichtet.</w:t>
+              <w:t xml:space="preserve">Dienste ohne </w:t>
+            </w:r>
+            <w:proofErr w:type="spellStart"/>
+            <w:r>
+              <w:t>Bounding</w:t>
+            </w:r>
+            <w:r>
+              <w:t>box</w:t>
+            </w:r>
+            <w:proofErr w:type="spellEnd"/>
+            <w:r>
+              <w:t xml:space="preserve"> eingerichtet.</w:t>
             </w:r>
           </w:p>
         </w:tc>
@@ -3742,8 +3947,13 @@
       <w:pPr>
         <w:pStyle w:val="berschrift2"/>
       </w:pPr>
+      <w:proofErr w:type="spellStart"/>
       <w:r>
-        <w:t>Interlis Export</w:t>
+        <w:t>Interlis</w:t>
+      </w:r>
+      <w:proofErr w:type="spellEnd"/>
+      <w:r>
+        <w:t xml:space="preserve"> Export</w:t>
       </w:r>
     </w:p>
     <w:tbl>
@@ -3801,9 +4011,11 @@
             <w:vAlign w:val="center"/>
           </w:tcPr>
           <w:p>
+            <w:proofErr w:type="gramStart"/>
             <w:r>
               <w:t>DMAV Bodenbedeckung</w:t>
             </w:r>
+            <w:proofErr w:type="gramEnd"/>
           </w:p>
         </w:tc>
         <w:tc>
@@ -3908,8 +4120,13 @@
           </w:tcPr>
           <w:p>
             <w:r>
-              <w:t>DMAV Diensbarkeitsgrenzen</w:t>
-            </w:r>
+              <w:t xml:space="preserve">DMAV </w:t>
+            </w:r>
+            <w:proofErr w:type="spellStart"/>
+            <w:r>
+              <w:t>Diensbarkeitsgrenzen</w:t>
+            </w:r>
+            <w:proofErr w:type="spellEnd"/>
           </w:p>
         </w:tc>
         <w:tc>
@@ -3960,9 +4177,11 @@
             <w:vAlign w:val="center"/>
           </w:tcPr>
           <w:p>
+            <w:proofErr w:type="gramStart"/>
             <w:r>
               <w:t>DMAV Einzelobjekte</w:t>
             </w:r>
+            <w:proofErr w:type="gramEnd"/>
           </w:p>
         </w:tc>
         <w:tc>
@@ -4072,9 +4291,11 @@
             <w:r>
               <w:t xml:space="preserve">DMAV </w:t>
             </w:r>
+            <w:proofErr w:type="spellStart"/>
             <w:r>
               <w:t>Gebaeudeardressen</w:t>
             </w:r>
+            <w:proofErr w:type="spellEnd"/>
           </w:p>
         </w:tc>
         <w:tc>
@@ -4128,9 +4349,11 @@
             <w:r>
               <w:t xml:space="preserve">DMAV </w:t>
             </w:r>
+            <w:proofErr w:type="spellStart"/>
             <w:r>
               <w:t>Grundstuecke</w:t>
             </w:r>
+            <w:proofErr w:type="spellEnd"/>
           </w:p>
         </w:tc>
         <w:tc>
@@ -4237,12 +4460,14 @@
             <w:vAlign w:val="center"/>
           </w:tcPr>
           <w:p>
+            <w:proofErr w:type="gramStart"/>
             <w:r>
               <w:t xml:space="preserve">DMAV </w:t>
             </w:r>
             <w:r>
               <w:t>Nomenklaturen</w:t>
             </w:r>
+            <w:proofErr w:type="gramEnd"/>
           </w:p>
         </w:tc>
         <w:tc>
@@ -4293,9 +4518,11 @@
             <w:vAlign w:val="center"/>
           </w:tcPr>
           <w:p>
+            <w:proofErr w:type="gramStart"/>
             <w:r>
               <w:t>DMAV Rohrleitungen</w:t>
             </w:r>
+            <w:proofErr w:type="gramEnd"/>
           </w:p>
         </w:tc>
         <w:tc>
@@ -4346,9 +4573,11 @@
             <w:vAlign w:val="center"/>
           </w:tcPr>
           <w:p>
+            <w:proofErr w:type="gramStart"/>
             <w:r>
               <w:t>DMAV Toleranzstufen</w:t>
             </w:r>
+            <w:proofErr w:type="gramEnd"/>
           </w:p>
         </w:tc>
         <w:tc>
@@ -4422,8 +4651,13 @@
       <w:pPr>
         <w:pStyle w:val="berschrift2"/>
       </w:pPr>
+      <w:proofErr w:type="spellStart"/>
       <w:r>
-        <w:t>Interlis Export Datensta</w:t>
+        <w:t>Interlis</w:t>
+      </w:r>
+      <w:proofErr w:type="spellEnd"/>
+      <w:r>
+        <w:t xml:space="preserve"> Export Datensta</w:t>
       </w:r>
       <w:r>
         <w:t>tistik</w:t>
@@ -8403,6 +8637,7 @@
   </w:compat>
   <w:rsids>
     <w:rsidRoot w:val="00776F3B"/>
+    <w:rsid w:val="00074000"/>
     <w:rsid w:val="000B2E5C"/>
     <w:rsid w:val="001867FB"/>
     <w:rsid w:val="001A0F33"/>
@@ -8413,6 +8648,7 @@
     <w:rsid w:val="00450A52"/>
     <w:rsid w:val="004C1560"/>
     <w:rsid w:val="004F7432"/>
+    <w:rsid w:val="00521024"/>
     <w:rsid w:val="005336CB"/>
     <w:rsid w:val="0054101E"/>
     <w:rsid w:val="005E0739"/>
@@ -8421,6 +8657,7 @@
     <w:rsid w:val="00776F3B"/>
     <w:rsid w:val="007F70EC"/>
     <w:rsid w:val="00811EB5"/>
+    <w:rsid w:val="008C0685"/>
     <w:rsid w:val="008D68F3"/>
     <w:rsid w:val="009235CD"/>
     <w:rsid w:val="00977492"/>

</xml_diff>